<commit_message>
Add resource-based strategy matrix visualizations and update memo
- Created EXHIBIT 3: Resource-Based Strategy Matrix heatmap
  * Shows resource strength (1-5 scale) across 5 resource categories
  * Mapped across 3 strategic dimensions
  * Includes specific resource descriptions for each cell
  * Business unit leverage comparison chart
  * Strategic fit assessment (alignment vs. implementation effectiveness)

- Created EXHIBIT 4: Resource Allocation and Integration Flow
  * Shows how 5 resource categories flow through integration/leverage
  * Maps to specific business outcomes (Blue, Model e, Pro)
  * Highlights resource-strategy alignment strengths and gaps

- Updated FORD_MEMO_V3_Integrated_Narrative_With_Resource_Matrix.docx
  * Now includes both resource matrix visualizations
  * Professional 300 DPI PNG charts embedded in memo
  * Total 8 figures (6 original + 2 new resource-based visualizations)

Files: 07_resource_based_strategy_matrix.png, 08_resource_allocation_flow.png
</commit_message>
<xml_diff>
--- a/FORD_MEMO_V3_Integrated_Narrative_With_Resource_Matrix.docx
+++ b/FORD_MEMO_V3_Integrated_Narrative_With_Resource_Matrix.docx
@@ -1068,6 +1068,123 @@
         <w:t>Ford Investor Relations. Financial Reports and SEC Filings. https://shareholder.ford.com/financials/default.aspx</w:t>
       </w:r>
     </w:p>
+    <w:p>
+      <w:pPr>
+        <w:spacing w:line="360" w:lineRule="auto"/>
+        <w:jc w:val="center"/>
+      </w:pPr>
+      <w:r>
+        <w:rPr>
+          <w:rFonts w:ascii="Times New Roman" w:hAnsi="Times New Roman"/>
+          <w:b/>
+          <w:sz w:val="22"/>
+        </w:rPr>
+        <w:t>EXHIBIT 1A: Resource Strength Heatmap and Business Unit Analysis</w:t>
+      </w:r>
+    </w:p>
+    <w:p>
+      <w:pPr>
+        <w:jc w:val="center"/>
+      </w:pPr>
+    </w:p>
+    <w:p>
+      <w:pPr>
+        <w:jc w:val="center"/>
+      </w:pPr>
+      <w:r>
+        <w:drawing>
+          <wp:inline xmlns:a="http://schemas.openxmlformats.org/drawingml/2006/main" xmlns:pic="http://schemas.openxmlformats.org/drawingml/2006/picture">
+            <wp:extent cx="5486400" cy="3287239"/>
+            <wp:docPr id="2" name="Picture 2"/>
+            <wp:cNvGraphicFramePr>
+              <a:graphicFrameLocks noChangeAspect="1"/>
+            </wp:cNvGraphicFramePr>
+            <a:graphic>
+              <a:graphicData uri="http://schemas.openxmlformats.org/drawingml/2006/picture">
+                <pic:pic>
+                  <pic:nvPicPr>
+                    <pic:cNvPr id="0" name="07_resource_based_strategy_matrix.png"/>
+                    <pic:cNvPicPr/>
+                  </pic:nvPicPr>
+                  <pic:blipFill>
+                    <a:blip r:embed="rId10"/>
+                    <a:stretch>
+                      <a:fillRect/>
+                    </a:stretch>
+                  </pic:blipFill>
+                  <pic:spPr>
+                    <a:xfrm>
+                      <a:off x="0" y="0"/>
+                      <a:ext cx="5486400" cy="3287239"/>
+                    </a:xfrm>
+                    <a:prstGeom prst="rect"/>
+                  </pic:spPr>
+                </pic:pic>
+              </a:graphicData>
+            </a:graphic>
+          </wp:inline>
+        </w:drawing>
+      </w:r>
+    </w:p>
+    <w:p/>
+    <w:p>
+      <w:pPr>
+        <w:spacing w:line="360" w:lineRule="auto"/>
+        <w:jc w:val="center"/>
+      </w:pPr>
+      <w:r>
+        <w:rPr>
+          <w:rFonts w:ascii="Times New Roman" w:hAnsi="Times New Roman"/>
+          <w:b/>
+          <w:sz w:val="22"/>
+        </w:rPr>
+        <w:t>EXHIBIT 1B: Resource Allocation and Integration Flow</w:t>
+      </w:r>
+    </w:p>
+    <w:p>
+      <w:pPr>
+        <w:jc w:val="center"/>
+      </w:pPr>
+    </w:p>
+    <w:p>
+      <w:pPr>
+        <w:jc w:val="center"/>
+      </w:pPr>
+      <w:r>
+        <w:drawing>
+          <wp:inline xmlns:a="http://schemas.openxmlformats.org/drawingml/2006/main" xmlns:pic="http://schemas.openxmlformats.org/drawingml/2006/picture">
+            <wp:extent cx="5486400" cy="3507612"/>
+            <wp:docPr id="3" name="Picture 3"/>
+            <wp:cNvGraphicFramePr>
+              <a:graphicFrameLocks noChangeAspect="1"/>
+            </wp:cNvGraphicFramePr>
+            <a:graphic>
+              <a:graphicData uri="http://schemas.openxmlformats.org/drawingml/2006/picture">
+                <pic:pic>
+                  <pic:nvPicPr>
+                    <pic:cNvPr id="0" name="08_resource_allocation_flow.png"/>
+                    <pic:cNvPicPr/>
+                  </pic:nvPicPr>
+                  <pic:blipFill>
+                    <a:blip r:embed="rId11"/>
+                    <a:stretch>
+                      <a:fillRect/>
+                    </a:stretch>
+                  </pic:blipFill>
+                  <pic:spPr>
+                    <a:xfrm>
+                      <a:off x="0" y="0"/>
+                      <a:ext cx="5486400" cy="3507612"/>
+                    </a:xfrm>
+                    <a:prstGeom prst="rect"/>
+                  </pic:spPr>
+                </pic:pic>
+              </a:graphicData>
+            </a:graphic>
+          </wp:inline>
+        </w:drawing>
+      </w:r>
+    </w:p>
     <w:sectPr>
       <w:pgSz w:w="12240" w:h="15840"/>
       <w:pgMar w:top="1440" w:right="1440" w:bottom="1440" w:left="1440" w:header="720" w:footer="720" w:gutter="0"/>

</xml_diff>